<commit_message>
Made some edits to the spec
</commit_message>
<xml_diff>
--- a/docs/specification/TrailTrack_Specification.docx
+++ b/docs/specification/TrailTrack_Specification.docx
@@ -24,7 +24,7 @@
           <w:rFonts w:eastAsia="Calibri" w:cs="Calibri"/>
           <w:b/>
           <w:bCs/>
-          <w:color w:val="1F3864"/>
+          <w:color w:val="000000"/>
           <w:sz w:val="56"/>
           <w:szCs w:val="56"/>
         </w:rPr>
@@ -43,7 +43,7 @@
           <w:rFonts w:eastAsia="Calibri" w:cs="Calibri"/>
           <w:i/>
           <w:iCs/>
-          <w:color w:val="2F5496"/>
+          <w:color w:val="404040"/>
           <w:sz w:val="26"/>
           <w:szCs w:val="26"/>
         </w:rPr>
@@ -423,7 +423,7 @@
               <w:bottom w:val="single" w:sz="4" w:space="0" w:color="000000"/>
               <w:right w:val="single" w:sz="4" w:space="0" w:color="000000"/>
             </w:tcBorders>
-            <w:shd w:fill="2F5496" w:val="clear"/>
+            <w:shd w:fill="D9D9D9" w:val="clear"/>
             <w:vAlign w:val="center"/>
           </w:tcPr>
           <w:p>
@@ -446,7 +446,7 @@
               <w:bottom w:val="single" w:sz="4" w:space="0" w:color="000000"/>
               <w:right w:val="single" w:sz="4" w:space="0" w:color="000000"/>
             </w:tcBorders>
-            <w:shd w:fill="2F5496" w:val="clear"/>
+            <w:shd w:fill="D9D9D9" w:val="clear"/>
             <w:vAlign w:val="center"/>
           </w:tcPr>
           <w:p>
@@ -460,7 +460,7 @@
                 <w:rFonts w:eastAsia="Calibri" w:cs="Calibri"/>
                 <w:b/>
                 <w:bCs/>
-                <w:color w:val="FFFFFF"/>
+                <w:color w:val="000000"/>
                 <w:sz w:val="20"/>
                 <w:szCs w:val="20"/>
               </w:rPr>
@@ -477,7 +477,7 @@
               <w:bottom w:val="single" w:sz="4" w:space="0" w:color="000000"/>
               <w:right w:val="single" w:sz="4" w:space="0" w:color="000000"/>
             </w:tcBorders>
-            <w:shd w:fill="2F5496" w:val="clear"/>
+            <w:shd w:fill="D9D9D9" w:val="clear"/>
             <w:vAlign w:val="center"/>
           </w:tcPr>
           <w:p>
@@ -491,7 +491,7 @@
                 <w:rFonts w:eastAsia="Calibri" w:cs="Calibri"/>
                 <w:b/>
                 <w:bCs/>
-                <w:color w:val="FFFFFF"/>
+                <w:color w:val="000000"/>
                 <w:sz w:val="20"/>
                 <w:szCs w:val="20"/>
               </w:rPr>
@@ -508,7 +508,7 @@
               <w:bottom w:val="single" w:sz="4" w:space="0" w:color="000000"/>
               <w:right w:val="single" w:sz="4" w:space="0" w:color="000000"/>
             </w:tcBorders>
-            <w:shd w:fill="2F5496" w:val="clear"/>
+            <w:shd w:fill="D9D9D9" w:val="clear"/>
             <w:vAlign w:val="center"/>
           </w:tcPr>
           <w:p>
@@ -522,7 +522,7 @@
                 <w:rFonts w:eastAsia="Calibri" w:cs="Calibri"/>
                 <w:b/>
                 <w:bCs/>
-                <w:color w:val="FFFFFF"/>
+                <w:color w:val="000000"/>
                 <w:sz w:val="20"/>
                 <w:szCs w:val="20"/>
               </w:rPr>
@@ -1467,7 +1467,7 @@
               <w:bottom w:val="single" w:sz="4" w:space="0" w:color="000000"/>
               <w:right w:val="single" w:sz="4" w:space="0" w:color="000000"/>
             </w:tcBorders>
-            <w:shd w:fill="2F5496" w:val="clear"/>
+            <w:shd w:fill="D9D9D9" w:val="clear"/>
             <w:vAlign w:val="center"/>
           </w:tcPr>
           <w:p>
@@ -1481,7 +1481,7 @@
                 <w:rFonts w:eastAsia="Calibri" w:cs="Calibri"/>
                 <w:b/>
                 <w:bCs/>
-                <w:color w:val="FFFFFF"/>
+                <w:color w:val="000000"/>
                 <w:sz w:val="20"/>
                 <w:szCs w:val="20"/>
               </w:rPr>
@@ -1498,7 +1498,7 @@
               <w:bottom w:val="single" w:sz="4" w:space="0" w:color="000000"/>
               <w:right w:val="single" w:sz="4" w:space="0" w:color="000000"/>
             </w:tcBorders>
-            <w:shd w:fill="2F5496" w:val="clear"/>
+            <w:shd w:fill="D9D9D9" w:val="clear"/>
             <w:vAlign w:val="center"/>
           </w:tcPr>
           <w:p>
@@ -1512,7 +1512,7 @@
                 <w:rFonts w:eastAsia="Calibri" w:cs="Calibri"/>
                 <w:b/>
                 <w:bCs/>
-                <w:color w:val="FFFFFF"/>
+                <w:color w:val="000000"/>
                 <w:sz w:val="20"/>
                 <w:szCs w:val="20"/>
               </w:rPr>
@@ -2000,7 +2000,7 @@
         <w:rPr/>
         <w:drawing>
           <wp:inline distT="0" distB="0" distL="0" distR="0">
-            <wp:extent cx="4846320" cy="3002915"/>
+            <wp:extent cx="4846320" cy="2796548"/>
             <wp:effectExtent l="0" t="0" r="0" b="0"/>
             <wp:docPr id="1" name="Picture 1" descr=""/>
             <wp:cNvGraphicFramePr>
@@ -2024,7 +2024,7 @@
                   <pic:spPr bwMode="auto">
                     <a:xfrm>
                       <a:off x="0" y="0"/>
-                      <a:ext cx="4846320" cy="3002915"/>
+                      <a:ext cx="4846320" cy="2796548"/>
                     </a:xfrm>
                     <a:prstGeom prst="rect">
                       <a:avLst/>
@@ -2722,7 +2722,7 @@
               <w:bottom w:val="single" w:sz="4" w:space="0" w:color="000000"/>
               <w:right w:val="single" w:sz="4" w:space="0" w:color="000000"/>
             </w:tcBorders>
-            <w:shd w:fill="2F5496" w:val="clear"/>
+            <w:shd w:fill="D9D9D9" w:val="clear"/>
             <w:vAlign w:val="center"/>
           </w:tcPr>
           <w:p>
@@ -2737,7 +2737,7 @@
                 <w:rFonts w:eastAsia="Calibri" w:cs="Calibri"/>
                 <w:b/>
                 <w:bCs/>
-                <w:color w:val="FFFFFF"/>
+                <w:color w:val="000000"/>
                 <w:sz w:val="20"/>
                 <w:szCs w:val="20"/>
               </w:rPr>
@@ -2754,7 +2754,7 @@
               <w:bottom w:val="single" w:sz="4" w:space="0" w:color="000000"/>
               <w:right w:val="single" w:sz="4" w:space="0" w:color="000000"/>
             </w:tcBorders>
-            <w:shd w:fill="2F5496" w:val="clear"/>
+            <w:shd w:fill="D9D9D9" w:val="clear"/>
             <w:vAlign w:val="center"/>
           </w:tcPr>
           <w:p>
@@ -2769,7 +2769,7 @@
                 <w:rFonts w:eastAsia="Calibri" w:cs="Calibri"/>
                 <w:b/>
                 <w:bCs/>
-                <w:color w:val="FFFFFF"/>
+                <w:color w:val="000000"/>
                 <w:sz w:val="20"/>
                 <w:szCs w:val="20"/>
               </w:rPr>
@@ -2786,7 +2786,7 @@
               <w:bottom w:val="single" w:sz="4" w:space="0" w:color="000000"/>
               <w:right w:val="single" w:sz="4" w:space="0" w:color="000000"/>
             </w:tcBorders>
-            <w:shd w:fill="2F5496" w:val="clear"/>
+            <w:shd w:fill="D9D9D9" w:val="clear"/>
             <w:vAlign w:val="center"/>
           </w:tcPr>
           <w:p>
@@ -2801,7 +2801,7 @@
                 <w:rFonts w:eastAsia="Calibri" w:cs="Calibri"/>
                 <w:b/>
                 <w:bCs/>
-                <w:color w:val="FFFFFF"/>
+                <w:color w:val="000000"/>
                 <w:sz w:val="20"/>
                 <w:szCs w:val="20"/>
               </w:rPr>
@@ -2818,7 +2818,7 @@
               <w:bottom w:val="single" w:sz="4" w:space="0" w:color="000000"/>
               <w:right w:val="single" w:sz="4" w:space="0" w:color="000000"/>
             </w:tcBorders>
-            <w:shd w:fill="2F5496" w:val="clear"/>
+            <w:shd w:fill="D9D9D9" w:val="clear"/>
             <w:vAlign w:val="center"/>
           </w:tcPr>
           <w:p>
@@ -2832,7 +2832,7 @@
                 <w:rFonts w:eastAsia="Calibri" w:cs="Calibri"/>
                 <w:b/>
                 <w:bCs/>
-                <w:color w:val="FFFFFF"/>
+                <w:color w:val="000000"/>
                 <w:sz w:val="20"/>
                 <w:szCs w:val="20"/>
               </w:rPr>
@@ -3666,7 +3666,7 @@
       <w:rFonts w:ascii="Calibri" w:hAnsi="Calibri" w:eastAsia="Calibri" w:cs="Calibri"/>
       <w:b/>
       <w:bCs/>
-      <w:color w:val="1F3864"/>
+      <w:color w:val="000000"/>
       <w:sz w:val="28"/>
       <w:szCs w:val="28"/>
     </w:rPr>
@@ -3683,7 +3683,7 @@
       <w:rFonts w:ascii="Calibri" w:hAnsi="Calibri" w:eastAsia="Calibri" w:cs="Calibri"/>
       <w:b/>
       <w:bCs/>
-      <w:color w:val="2F5496"/>
+      <w:color w:val="404040"/>
       <w:sz w:val="24"/>
       <w:szCs w:val="24"/>
     </w:rPr>
@@ -3694,7 +3694,7 @@
     <w:qFormat/>
     <w:pPr/>
     <w:rPr>
-      <w:color w:val="1F4D78"/>
+      <w:color w:val="404040"/>
       <w:sz w:val="24"/>
       <w:szCs w:val="24"/>
     </w:rPr>
@@ -3707,7 +3707,7 @@
     <w:rPr>
       <w:i/>
       <w:iCs/>
-      <w:color w:val="2E74B5"/>
+      <w:color w:val="404040"/>
     </w:rPr>
   </w:style>
   <w:style w:type="paragraph" w:styleId="Heading5">
@@ -3716,7 +3716,7 @@
     <w:qFormat/>
     <w:pPr/>
     <w:rPr>
-      <w:color w:val="2E74B5"/>
+      <w:color w:val="404040"/>
     </w:rPr>
   </w:style>
   <w:style w:type="paragraph" w:styleId="Heading6">
@@ -3725,7 +3725,7 @@
     <w:qFormat/>
     <w:pPr/>
     <w:rPr>
-      <w:color w:val="1F4D78"/>
+      <w:color w:val="404040"/>
     </w:rPr>
   </w:style>
   <w:style w:type="character" w:styleId="Hyperlink">
@@ -3733,7 +3733,7 @@
     <w:uiPriority w:val="99"/>
     <w:unhideWhenUsed/>
     <w:rPr>
-      <w:color w:val="0563C1"/>
+      <w:color w:val="404040"/>
       <w:u w:val="single"/>
     </w:rPr>
   </w:style>

</xml_diff>